<commit_message>
Revise RQ2 protocol to standardized agent repair
The proposal (not yet submitted) now defines maintenance as a
standardized, automated repair process: one AI coding agent with
a fixed minimal-fix instruction applied identically to both test
suites, measuring tests fixed, diff LOC and suite-restore time.
This removes the need for manual student timing while keeping
all three RQ2 metrics; the limitation (agent time does not
represent manual engineer effort) goes to Threats to Validity.

docs/gvhd-trao-doi.md collects the five talking points for the
advisor meeting plus the follow-up matrix. CLAUDE.md, the RQ2
write-up, Chapter 4 draft and the plan status were synced.
</commit_message>
<xml_diff>
--- a/docs/DeCuong_VLM_GUI_Testing_TongQuat.docx
+++ b/docs/DeCuong_VLM_GUI_Testing_TongQuat.docx
@@ -525,7 +525,7 @@
           <w:i w:val="0"/>
           <w:sz w:val="26"/>
         </w:rPr>
-        <w:t>– Thiết kế và đo lường bộ chỉ số thực nghiệm: tỉ lệ test pass trên giao diện gốc và các biến thể giao diện (đổi theme, bố cục, biểu tượng); độ ổn định kết quả (flakiness) — mỗi test được chạy lặp 3-5 lần do đặc tính bất định của VLM; thời gian thực thi; chi phí gọi API (số token, chi phí ước tính, độ trễ); và chi phí bảo trì — được định nghĩa là số test case phải chỉnh sửa cùng số dòng code/cấu hình thay đổi (diff LOC) khi giao diện thay đổi, do cùng một người thực hiện theo quy trình thống nhất cho cả hai phương pháp nhằm hạn chế thiên lệch.</w:t>
+        <w:t>– Thiết kế và đo lường bộ chỉ số thực nghiệm: tỉ lệ test pass trên giao diện gốc và các biến thể giao diện (đổi theme, bố cục, biểu tượng); độ ổn định kết quả (flakiness) — mỗi test được chạy lặp 3-5 lần do đặc tính bất định của VLM; thời gian thực thi; chi phí gọi API (số token, chi phí ước tính, độ trễ); và chi phí bảo trì — được định nghĩa là số test case phải chỉnh sửa, số dòng code/cấu hình thay đổi (diff LOC) và thời gian phục hồi bộ test khi giao diện thay đổi; việc bảo trì được thực hiện bởi cùng một quy trình sửa chuẩn hóa, tự động (AI coding agent với chỉ dẫn cố định: sửa tối thiểu để bộ test đạt trở lại, chỉ thay đổi selector/assertion, không tái cấu trúc), áp dụng đồng nhất cho cả hai phương pháp trên nhánh mã nguồn riêng của từng biến thể nhằm hạn chế thiên lệch và bảo đảm khả năng tái lập; các chỉ số được trích tự động từ lịch sử git và log thực thi.</w:t>
       </w:r>
     </w:p>
     <w:p>
@@ -1298,7 +1298,7 @@
           <w:i w:val="0"/>
           <w:sz w:val="26"/>
         </w:rPr>
-        <w:t>– Đo chi phí bảo trì khi giao diện thay đổi: số test case phải chỉnh sửa và số dòng code/cấu hình thay đổi (diff LOC) ở mỗi phương pháp, do cùng một người thực hiện theo quy trình thống nhất.</w:t>
+        <w:t>– Đo chi phí bảo trì khi giao diện thay đổi: số test case phải chỉnh sửa, số dòng code/cấu hình thay đổi (diff LOC) và thời gian phục hồi bộ test ở mỗi phương pháp; việc bảo trì do cùng một quy trình sửa chuẩn hóa, tự động (AI coding agent với chỉ dẫn cố định về sửa tối thiểu) thực hiện đồng nhất cho cả hai phương pháp; hạn chế của cách đo này (thời gian của tác nhân tự động không đại diện cho công sức bảo trì thủ công của kỹ sư kiểm thử) được ghi nhận trong mục Threats to Validity.</w:t>
       </w:r>
     </w:p>
     <w:p>

</xml_diff>